<commit_message>
Deploy preview for PR 50 🛫
</commit_message>
<xml_diff>
--- a/pr-preview/pr-50/Your-Book-Title-tracked-changes.docx
+++ b/pr-preview/pr-50/Your-Book-Title-tracked-changes.docx
@@ -2278,7 +2278,7 @@
       </w:ins>
       <w:ins w:id="80" w:author="PR Preview" w:date="2024-01-01T00:00:00Z">
         <w:r>
-          <w:t xml:space="preserve">02b91b2</w:t>
+          <w:t xml:space="preserve">8db4bec</w:t>
         </w:r>
       </w:ins>
     </w:p>
@@ -2306,7 +2306,7 @@
       </w:ins>
       <w:ins w:id="81" w:author="PR Preview" w:date="2024-01-01T00:00:00Z">
         <w:r>
-          <w:t xml:space="preserve">02b91b2b75ed0e8aa75773fced66d380e9cc3d49</w:t>
+          <w:t xml:space="preserve">8db4bec4915907081efbbd965e0db3fa827b8920</w:t>
         </w:r>
       </w:ins>
     </w:p>
@@ -2334,7 +2334,7 @@
       </w:ins>
       <w:ins w:id="82" w:author="PR Preview" w:date="2024-01-01T00:00:00Z">
         <w:r>
-          <w:t xml:space="preserve">2026-06-27 00:01:30 +0000</w:t>
+          <w:t xml:space="preserve">2026-06-26 16:58:56 -0700</w:t>
         </w:r>
       </w:ins>
     </w:p>

</xml_diff>